<commit_message>
Deploy preview for PR 611 🛫
</commit_message>
<xml_diff>
--- a/pr-preview/pr-611/vignettes/articles/version-crosswalk-1.3-to-1.4.docx
+++ b/pr-preview/pr-611/vignettes/articles/version-crosswalk-1.3-to-1.4.docx
@@ -3049,7 +3049,7 @@
         <w:rPr>
           <w:rStyle w:val="CommentTok"/>
         </w:rPr>
-        <w:t xml:space="preserve">#&gt;     age id    antigen_iso   value</w:t>
+        <w:t xml:space="preserve">#&gt;     age id    antigen_iso    value</w:t>
       </w:r>
       <w:r>
         <w:br/>
@@ -3058,7 +3058,7 @@
         <w:rPr>
           <w:rStyle w:val="CommentTok"/>
         </w:rPr>
-        <w:t xml:space="preserve">#&gt;   &lt;dbl&gt; &lt;chr&gt; &lt;chr&gt;         &lt;dbl&gt;</w:t>
+        <w:t xml:space="preserve">#&gt;   &lt;dbl&gt; &lt;chr&gt; &lt;chr&gt;          &lt;dbl&gt;</w:t>
       </w:r>
       <w:r>
         <w:br/>
@@ -3067,7 +3067,7 @@
         <w:rPr>
           <w:rStyle w:val="CommentTok"/>
         </w:rPr>
-        <w:t xml:space="preserve">#&gt; 1  8.74 1     HlyE_IgA     14.1  </w:t>
+        <w:t xml:space="preserve">#&gt; 1 14.5  1     HlyE_IgA     418.   </w:t>
       </w:r>
       <w:r>
         <w:br/>
@@ -3076,7 +3076,7 @@
         <w:rPr>
           <w:rStyle w:val="CommentTok"/>
         </w:rPr>
-        <w:t xml:space="preserve">#&gt; 2  8.74 1     HlyE_IgG      1.77 </w:t>
+        <w:t xml:space="preserve">#&gt; 2 14.5  1     HlyE_IgG     274.   </w:t>
       </w:r>
       <w:r>
         <w:br/>
@@ -3085,7 +3085,7 @@
         <w:rPr>
           <w:rStyle w:val="CommentTok"/>
         </w:rPr>
-        <w:t xml:space="preserve">#&gt; 3  0.21 2     HlyE_IgA      0.633</w:t>
+        <w:t xml:space="preserve">#&gt; 3  9.1  2     HlyE_IgA       1.97 </w:t>
       </w:r>
       <w:r>
         <w:br/>
@@ -3094,7 +3094,7 @@
         <w:rPr>
           <w:rStyle w:val="CommentTok"/>
         </w:rPr>
-        <w:t xml:space="preserve">#&gt; 4  0.21 2     HlyE_IgG      0.617</w:t>
+        <w:t xml:space="preserve">#&gt; 4  9.1  2     HlyE_IgG       0.917</w:t>
       </w:r>
       <w:r>
         <w:br/>
@@ -3103,7 +3103,7 @@
         <w:rPr>
           <w:rStyle w:val="CommentTok"/>
         </w:rPr>
-        <w:t xml:space="preserve">#&gt; 5  9.82 3     HlyE_IgA      0.249</w:t>
+        <w:t xml:space="preserve">#&gt; 5  2.22 3     HlyE_IgA    1103.   </w:t>
       </w:r>
       <w:r>
         <w:br/>
@@ -3112,7 +3112,7 @@
         <w:rPr>
           <w:rStyle w:val="CommentTok"/>
         </w:rPr>
-        <w:t xml:space="preserve">#&gt; 6  9.82 3     HlyE_IgG    116.</w:t>
+        <w:t xml:space="preserve">#&gt; 6  2.22 3     HlyE_IgG     139.</w:t>
       </w:r>
       <w:r>
         <w:br/>

</xml_diff>